<commit_message>
fix: unificar flujo documental e imagenes en merge PDF sin videos
Reemplaza c188782 y ba86774 en un solo commit sin archivos .mp4. Incluye ImageFieldValuesEnricher, vinculacion de adjuntos imagen en frontend, plantillas Word actualizadas y navegacion sin modulo Actas duplicado.

Co-authored-by: Cursor <cursoragent@cursor.com>
</commit_message>
<xml_diff>
--- a/PRODUCTO/BACKEND/somosbarrio-backend/templates/ACTA_MESA_COMUNITARIA_TEMPLATE.docx
+++ b/PRODUCTO/BACKEND/somosbarrio-backend/templates/ACTA_MESA_COMUNITARIA_TEMPLATE.docx
@@ -604,7 +604,29 @@
                 <w:sz w:val="18"/>
                 <w:szCs w:val="18"/>
               </w:rPr>
-              <w:t>convocada_por</w:t>
+              <w:t>convocad</w:t>
+            </w:r>
+            <w:r>
+              <w:rPr>
+                <w:rFonts w:ascii="Verdana" w:eastAsia="Verdana" w:hAnsi="Verdana" w:cs="Verdana"/>
+                <w:b/>
+                <w:bCs/>
+                <w:color w:val="262626"/>
+                <w:sz w:val="18"/>
+                <w:szCs w:val="18"/>
+              </w:rPr>
+              <w:t>o</w:t>
+            </w:r>
+            <w:r>
+              <w:rPr>
+                <w:rFonts w:ascii="Verdana" w:eastAsia="Verdana" w:hAnsi="Verdana" w:cs="Verdana"/>
+                <w:b/>
+                <w:bCs/>
+                <w:color w:val="262626"/>
+                <w:sz w:val="18"/>
+                <w:szCs w:val="18"/>
+              </w:rPr>
+              <w:t>_por</w:t>
             </w:r>
             <w:proofErr w:type="spellEnd"/>
             <w:r>
@@ -2102,26 +2124,21 @@
               </w:rPr>
             </w:pPr>
             <w:r>
-              <w:t>${IMG:&lt;</w:t>
+              <w:t>${</w:t>
             </w:r>
             <w:proofErr w:type="spellStart"/>
-            <w:r>
-              <w:t>uuid</w:t>
+            <w:proofErr w:type="gramStart"/>
+            <w:r>
+              <w:t>IMG:foto</w:t>
+            </w:r>
+            <w:proofErr w:type="gramEnd"/>
+            <w:r>
+              <w:t>_mesa_uuid</w:t>
             </w:r>
             <w:proofErr w:type="spellEnd"/>
             <w:r>
-              <w:t>-del-adjunto&gt;}</w:t>
-            </w:r>
-          </w:p>
-          <w:p>
-            <w:pPr>
-              <w:rPr>
-                <w:rFonts w:ascii="Verdana" w:eastAsia="Verdana" w:hAnsi="Verdana" w:cs="Verdana"/>
-                <w:color w:val="262626"/>
-                <w:sz w:val="18"/>
-                <w:szCs w:val="18"/>
-              </w:rPr>
-            </w:pPr>
+              <w:t>}</w:t>
+            </w:r>
           </w:p>
           <w:p>
             <w:pPr>

</xml_diff>